<commit_message>
Trames ENT-5.1 et 5.2 : encadré « À la fin de la séance » et phrase de l'écran à jour
- ENT-5.1, étape 6 : la question « Pour réfléchir » cite « car ce candidat a le CACES. »,
  comme l'écran ; le corrigé de la trame suit et perd sa note périmée.
- ENT-5.1 et 5.2 : encadré qui explique le bandeau de fin et relie chaque titre de jalon
  à l'étape de la trame (5.2 : sans le nombre de pièces, renvoi au professeur).

Co-Authored-By: Claude Opus 5.5 <noreply@anthropic.com>
</commit_message>
<xml_diff>
--- a/contenus/trames/ENT-5.1-smoby-recrutement-trame-eleve.docx
+++ b/contenus/trames/ENT-5.1-smoby-recrutement-trame-eleve.docx
@@ -4165,7 +4165,7 @@
                 <w:b/>
                 <w:sz w:val="21"/>
               </w:rPr>
-              <w:t>« Car il a le CACES. » : pourquoi cette raison ne suffit-elle pas pour convaincre Sophie ?</w:t>
+              <w:t>La raison « car ce candidat a le CACES. » ne suffit pas pour convaincre Sophie : pourquoi ?</w:t>
             </w:r>
           </w:p>
           <w:p>
@@ -4213,6 +4213,7 @@
     </w:tbl>
     <w:p>
       <w:pPr>
+        <w:keepNext/>
         <w:spacing w:after="0" w:line="60" w:lineRule="exact"/>
       </w:pPr>
       <w:r>
@@ -4220,6 +4221,156 @@
           <w:sz w:val="10"/>
         </w:rPr>
       </w:r>
+    </w:p>
+    <w:tbl>
+      <w:tblPr>
+        <w:tblStyle w:val="TableGrid"/>
+        <w:tblW w:type="auto" w:w="0"/>
+        <w:jc w:val="left"/>
+        <w:tblLook w:firstColumn="1" w:firstRow="1" w:lastColumn="0" w:lastRow="0" w:noHBand="0" w:noVBand="1" w:val="04A0"/>
+      </w:tblPr>
+      <w:tblGrid>
+        <w:gridCol w:w="10086"/>
+      </w:tblGrid>
+      <w:tr>
+        <w:trPr>
+          <w:cantSplit/>
+        </w:trPr>
+        <w:tc>
+          <w:tcPr>
+            <w:tcW w:type="dxa" w:w="10086"/>
+            <w:shd w:fill="F2F2F2"/>
+          </w:tcPr>
+          <w:p>
+            <w:pPr>
+              <w:keepNext/>
+              <w:spacing w:after="40"/>
+            </w:pPr>
+            <w:r>
+              <w:rPr>
+                <w:b/>
+                <w:color w:val="111111"/>
+                <w:sz w:val="20"/>
+              </w:rPr>
+              <w:t xml:space="preserve">À la fin de la séance : </w:t>
+            </w:r>
+            <w:r>
+              <w:rPr>
+                <w:sz w:val="20"/>
+              </w:rPr>
+              <w:t>quand tu as tout envoyé, un bandeau s'affiche en haut de l'écran.</w:t>
+            </w:r>
+          </w:p>
+          <w:p>
+            <w:pPr>
+              <w:keepNext/>
+              <w:spacing w:before="0" w:after="40"/>
+              <w:ind w:left="397" w:hanging="227"/>
+            </w:pPr>
+            <w:r>
+              <w:rPr>
+                <w:sz w:val="20"/>
+              </w:rPr>
+              <w:t>•  « Séance validée » : tout est juste. La séance ENT-5.2 s'ouvre pour toi.</w:t>
+            </w:r>
+          </w:p>
+          <w:p>
+            <w:pPr>
+              <w:keepNext/>
+              <w:spacing w:before="0" w:after="40"/>
+              <w:ind w:left="397" w:hanging="227"/>
+            </w:pPr>
+            <w:r>
+              <w:rPr>
+                <w:sz w:val="20"/>
+              </w:rPr>
+              <w:t>•  Sinon, le bandeau donne le titre de ce qui est à corriger (jamais la réponse). Cherche ce titre ci-dessous, puis relis ta trame à cette étape.</w:t>
+            </w:r>
+          </w:p>
+          <w:p>
+            <w:pPr>
+              <w:keepNext/>
+              <w:spacing w:before="0" w:after="40"/>
+              <w:ind w:left="397" w:hanging="227"/>
+            </w:pPr>
+            <w:r>
+              <w:rPr>
+                <w:sz w:val="20"/>
+              </w:rPr>
+              <w:t>•  « Tableau de tri : la ligne de … est juste » : étapes 3 et 4.</w:t>
+            </w:r>
+          </w:p>
+          <w:p>
+            <w:pPr>
+              <w:keepNext/>
+              <w:spacing w:before="0" w:after="40"/>
+              <w:ind w:left="397" w:hanging="227"/>
+            </w:pPr>
+            <w:r>
+              <w:rPr>
+                <w:sz w:val="20"/>
+              </w:rPr>
+              <w:t>•  « Le bon candidat est retenu » : étape 4.</w:t>
+            </w:r>
+          </w:p>
+          <w:p>
+            <w:pPr>
+              <w:keepNext/>
+              <w:spacing w:before="0" w:after="40"/>
+              <w:ind w:left="397" w:hanging="227"/>
+            </w:pPr>
+            <w:r>
+              <w:rPr>
+                <w:sz w:val="20"/>
+              </w:rPr>
+              <w:t>•  « Le bon contrat est choisi » : étape 5.</w:t>
+            </w:r>
+          </w:p>
+          <w:p>
+            <w:pPr>
+              <w:keepNext/>
+              <w:spacing w:before="0" w:after="40"/>
+              <w:ind w:left="397" w:hanging="227"/>
+            </w:pPr>
+            <w:r>
+              <w:rPr>
+                <w:sz w:val="20"/>
+              </w:rPr>
+              <w:t>•  « Message à Sophie : … » : étape 6.</w:t>
+            </w:r>
+          </w:p>
+          <w:p>
+            <w:pPr>
+              <w:keepNext/>
+              <w:spacing w:before="0" w:after="40"/>
+              <w:ind w:left="397" w:hanging="227"/>
+            </w:pPr>
+            <w:r>
+              <w:rPr>
+                <w:sz w:val="20"/>
+              </w:rPr>
+              <w:t>•  Pour corriger, tu réinitialises la séance : ton travail à l'écran est effacé et tu recommences. Garde ce carnet, il te fera aller plus vite. Si tu ne trouves pas, appelle ton professeur.</w:t>
+            </w:r>
+          </w:p>
+          <w:p>
+            <w:pPr>
+              <w:spacing w:before="0" w:after="0"/>
+              <w:ind w:left="397" w:hanging="227"/>
+            </w:pPr>
+            <w:r>
+              <w:rPr>
+                <w:sz w:val="20"/>
+              </w:rPr>
+              <w:t>•  La séance ENT-5.2 ne s'ouvre que quand tout est juste.</w:t>
+            </w:r>
+          </w:p>
+        </w:tc>
+      </w:tr>
+    </w:tbl>
+    <w:p>
+      <w:pPr>
+        <w:spacing w:after="40"/>
+      </w:pPr>
     </w:p>
     <w:p>
       <w:pPr>

</xml_diff>